<commit_message>
Deposit trimmed to 9pp — inside the import limit
</commit_message>
<xml_diff>
--- a/docs/sst-publications/03-protocolsio-DEPOSIT.docx
+++ b/docs/sst-publications/03-protocolsio-DEPOSIT.docx
@@ -2,7 +2,7 @@
 <file path=word/document.xml><?xml version="1.0" encoding="utf-8"?>
 <w:document xmlns:w="http://schemas.openxmlformats.org/wordprocessingml/2006/main" xmlns:m="http://schemas.openxmlformats.org/officeDocument/2006/math" xmlns:r="http://schemas.openxmlformats.org/officeDocument/2006/relationships" xmlns:o="urn:schemas-microsoft-com:office:office" xmlns:v="urn:schemas-microsoft-com:vml" xmlns:w10="urn:schemas-microsoft-com:office:word" xmlns:a="http://schemas.openxmlformats.org/drawingml/2006/main" xmlns:pic="http://schemas.openxmlformats.org/drawingml/2006/picture" xmlns:wp="http://schemas.openxmlformats.org/drawingml/2006/wordprocessingDrawing">
   <w:body>
-    <w:bookmarkStart w:id="19" w:name="Xa5cd5602973855d8e0c87c2fcf965e7ddfea9ab"/>
+    <w:bookmarkStart w:id="18" w:name="Xa5cd5602973855d8e0c87c2fcf965e7ddfea9ab"/>
     <w:p>
       <w:pPr>
         <w:pStyle w:val="Heading1"/>
@@ -113,341 +113,16 @@
         <w:t xml:space="preserve">an effectiveness study)</w:t>
       </w:r>
     </w:p>
-    <w:p>
-      <w:pPr>
-        <w:pStyle w:val="BodyText"/>
-      </w:pPr>
-      <w:r>
-        <w:rPr>
-          <w:b/>
-          <w:bCs/>
-        </w:rPr>
-        <w:t xml:space="preserve">Target venue:</w:t>
-      </w:r>
-      <w:r>
-        <w:t xml:space="preserve"> </w:t>
-      </w:r>
-      <w:r>
-        <w:rPr>
-          <w:i/>
-          <w:iCs/>
-        </w:rPr>
-        <w:t xml:space="preserve">JMIR Research Protocols</w:t>
-      </w:r>
-    </w:p>
-    <w:p>
-      <w:pPr>
-        <w:pStyle w:val="BodyText"/>
-      </w:pPr>
-      <w:r>
-        <w:rPr>
-          <w:b/>
-          <w:bCs/>
-        </w:rPr>
-        <w:t xml:space="preserve">Keywords:</w:t>
-      </w:r>
-      <w:r>
-        <w:t xml:space="preserve"> </w:t>
-      </w:r>
-      <w:r>
-        <w:t xml:space="preserve">concussion; mild traumatic brain injury; sub-symptom-threshold aerobic exercise; Buffalo Concussion Treadmill Test; heart-rate threshold; exercise intolerance; digital health; wearable; exercise physiology; clinical workflow; return to sport; return to learn</w:t>
-      </w:r>
-    </w:p>
-    <w:p>
-      <w:pPr>
-        <w:pStyle w:val="BodyText"/>
-      </w:pPr>
-      <w:r>
-        <w:rPr>
-          <w:b/>
-          <w:bCs/>
-        </w:rPr>
-        <w:t xml:space="preserve">Version note.</w:t>
-      </w:r>
-      <w:r>
-        <w:t xml:space="preserve"> </w:t>
-      </w:r>
-      <w:r>
-        <w:t xml:space="preserve">This manuscript supersedes an earlier draft of the same workflow, including a version previously deposited to protocols.io. The earlier version described procedural detail that the reference implementation does not perform. Every operational statement in this version has been checked line-by-line against the implementing source code, and the corrections are enumerated in the appendix,</w:t>
-      </w:r>
-      <w:r>
-        <w:t xml:space="preserve"> </w:t>
-      </w:r>
-      <w:r>
-        <w:t xml:space="preserve">“Changes from the prior draft.”</w:t>
-      </w:r>
-      <w:r>
-        <w:t xml:space="preserve"> </w:t>
-      </w:r>
-      <w:r>
-        <w:t xml:space="preserve">Where the implementation departs from the published Buffalo procedure, that departure is stated as a departure rather than smoothed over.</w:t>
-      </w:r>
-    </w:p>
-    <w:p>
-      <w:r>
-        <w:pict>
-          <v:rect style="width:0;height:1.5pt" o:hralign="center" o:hrstd="t" o:hr="t"/>
-        </w:pict>
-      </w:r>
-    </w:p>
-    <w:bookmarkStart w:id="10" w:name="design-principles"/>
+    <w:bookmarkStart w:id="15" w:name="the-five-stage-workflow"/>
     <w:p>
       <w:pPr>
         <w:pStyle w:val="Heading2"/>
       </w:pPr>
       <w:r>
-        <w:t xml:space="preserve">2. Design principles</w:t>
-      </w:r>
-    </w:p>
-    <w:p>
-      <w:pPr>
-        <w:pStyle w:val="FirstParagraph"/>
-      </w:pPr>
-      <w:r>
-        <w:rPr>
-          <w:b/>
-          <w:bCs/>
-        </w:rPr>
-        <w:t xml:space="preserve">2.1 Clinician-directed, not consumer self-managed.</w:t>
-      </w:r>
-      <w:r>
-        <w:t xml:space="preserve"> </w:t>
-      </w:r>
-      <w:r>
-        <w:t xml:space="preserve">A registered clinician confirms that the patient is appropriate for graded exercise rehabilitation, enables and oversees the threshold test, interprets it, owns the prescription, reviews each progression, and makes every clearance and return-to-activity decision. The software executes, paces, monitors, and records. It informs; it does not decide.</w:t>
-      </w:r>
-    </w:p>
-    <w:p>
-      <w:pPr>
-        <w:pStyle w:val="BodyText"/>
-      </w:pPr>
-      <w:r>
-        <w:t xml:space="preserve">The supervision model is clinician-</w:t>
-      </w:r>
-      <w:r>
-        <w:rPr>
-          <w:i/>
-          <w:iCs/>
-        </w:rPr>
-        <w:t xml:space="preserve">directed</w:t>
-      </w:r>
-      <w:r>
-        <w:t xml:space="preserve">, not clinician-</w:t>
-      </w:r>
-      <w:r>
-        <w:rPr>
-          <w:i/>
-          <w:iCs/>
-        </w:rPr>
-        <w:t xml:space="preserve">present</w:t>
-      </w:r>
-      <w:r>
-        <w:t xml:space="preserve">. As in all between-visit rehabilitation, the clinician exercises judgement at the point of direction - assessing appropriateness and instructing the programme - after which the patient implements it at home, unsupervised, and the clinician reviews at the next contact. The software’s encoded stop rules (the symptom-provocation threshold, the within-session symptom-rise stop, and the red-flag halt-and-refer path) are guardrails that operate in the clinician’s absence. They do not replace the clinician’s appropriateness decision; they execute the limits the clinician directed.</w:t>
-      </w:r>
-    </w:p>
-    <w:p>
-      <w:pPr>
-        <w:pStyle w:val="BodyText"/>
-      </w:pPr>
-      <w:r>
-        <w:rPr>
-          <w:b/>
-          <w:bCs/>
-        </w:rPr>
-        <w:t xml:space="preserve">2.2 The intended primary user is a registered exercise physiologist, and the graded test is a rehabilitation baseline measure.</w:t>
-      </w:r>
-      <w:r>
-        <w:t xml:space="preserve"> </w:t>
-      </w:r>
-      <w:r>
-        <w:t xml:space="preserve">The framework assumes an ESSA-accredited exercise physiologist (or equivalently scoped clinician) working from a diagnosis already made by a general practitioner or sports physician, and from an existing clearance for exercise rehabilitation. In that context the graded test is</w:t>
-      </w:r>
-      <w:r>
-        <w:t xml:space="preserve"> </w:t>
-      </w:r>
-      <w:r>
-        <w:rPr>
-          <w:i/>
-          <w:iCs/>
-        </w:rPr>
-        <w:t xml:space="preserve">not</w:t>
-      </w:r>
-      <w:r>
-        <w:t xml:space="preserve"> </w:t>
-      </w:r>
-      <w:r>
-        <w:t xml:space="preserve">a diagnostic provocative test - the diagnostic question has already been answered - but a rehabilitation baseline measure answering a different question: at what intensity can this already-diagnosed, exercise-cleared patient safely train</w:t>
-      </w:r>
-      <w:r>
-        <w:t xml:space="preserve"> </w:t>
-      </w:r>
-      <w:r>
-        <w:rPr>
-          <w:i/>
-          <w:iCs/>
-        </w:rPr>
-        <w:t xml:space="preserve">now</w:t>
-      </w:r>
-      <w:r>
-        <w:t xml:space="preserve">? Same physical procedure; different clinical meaning and scope context. This framing is load-bearing for §7’s regulatory positioning, and it is the accurate description of the intended workflow rather than a regulatory dress-up. The honest bound survives the reframe: the physical provocation is identical regardless of who supervises it and why, so the safety consideration does not disappear. What the framing settles is</w:t>
-      </w:r>
-      <w:r>
-        <w:t xml:space="preserve"> </w:t>
-      </w:r>
-      <w:r>
-        <w:rPr>
-          <w:i/>
-          <w:iCs/>
-        </w:rPr>
-        <w:t xml:space="preserve">who holds the clinical judgement about appropriateness</w:t>
-      </w:r>
-      <w:r>
-        <w:t xml:space="preserve"> </w:t>
-      </w:r>
-      <w:r>
-        <w:t xml:space="preserve">- clearly the clinician, not the software.</w:t>
-      </w:r>
-    </w:p>
-    <w:p>
-      <w:pPr>
-        <w:pStyle w:val="BodyText"/>
-      </w:pPr>
-      <w:r>
-        <w:rPr>
-          <w:b/>
-          <w:bCs/>
-        </w:rPr>
-        <w:t xml:space="preserve">2.3 Heart-rate-anchored and individualised on a measured threshold.</w:t>
-      </w:r>
-      <w:r>
-        <w:t xml:space="preserve"> </w:t>
-      </w:r>
-      <w:r>
-        <w:t xml:space="preserve">Every dose is derived from the patient’s own HRt, not from an age-predicted formula. Where graded testing is unavailable, a published standardised programme exists and may seed the band conservatively [10]. The percentage-of-HRt band is the only individualisation the evidence supports (§7).</w:t>
-      </w:r>
-    </w:p>
-    <w:p>
-      <w:pPr>
-        <w:pStyle w:val="BodyText"/>
-      </w:pPr>
-      <w:r>
-        <w:rPr>
-          <w:b/>
-          <w:bCs/>
-        </w:rPr>
-        <w:t xml:space="preserve">2.4 Real signal or no signal, and only verified signal advances the dose.</w:t>
-      </w:r>
-      <w:r>
-        <w:t xml:space="preserve"> </w:t>
-      </w:r>
-      <w:r>
-        <w:t xml:space="preserve">Heart rate is displayed only when actually measured. Bluetooth Low Energy heart-rate packets are range- and length-checked before use. Camera photoplethysmography returns</w:t>
-      </w:r>
-      <w:r>
-        <w:t xml:space="preserve"> </w:t>
-      </w:r>
-      <w:r>
-        <w:rPr>
-          <w:i/>
-          <w:iCs/>
-        </w:rPr>
-        <w:t xml:space="preserve">no value</w:t>
-      </w:r>
-      <w:r>
-        <w:t xml:space="preserve"> </w:t>
-      </w:r>
-      <w:r>
-        <w:t xml:space="preserve">rather than a guess when its periodicity confidence falls below threshold, and is restricted to a resting spot-check: it is excluded from every exertion screen because motion artefact makes it unreliable during exercise. Loss of signal clears the on-screen value rather than holding the last-known number. Progression is stricter still: only a session sourced from a live Bluetooth stream, with at least 80% of its readings matching a fresh live feed at the moment of logging, may raise the ceiling. Manual entry can never be verified.</w:t>
-      </w:r>
-    </w:p>
-    <w:p>
-      <w:pPr>
-        <w:pStyle w:val="BodyText"/>
-      </w:pPr>
-      <w:r>
-        <w:rPr>
-          <w:b/>
-          <w:bCs/>
-        </w:rPr>
-        <w:t xml:space="preserve">2.5 Safety logic travels with the patient.</w:t>
-      </w:r>
-      <w:r>
-        <w:t xml:space="preserve"> </w:t>
-      </w:r>
-      <w:r>
-        <w:t xml:space="preserve">The within-session symptom-stop rule and the red-flag halt-and-refer path are encoded in the tool rather than left to recalled verbal instruction.</w:t>
-      </w:r>
-    </w:p>
-    <w:p>
-      <w:pPr>
-        <w:pStyle w:val="BodyText"/>
-      </w:pPr>
-      <w:r>
-        <w:rPr>
-          <w:b/>
-          <w:bCs/>
-        </w:rPr>
-        <w:t xml:space="preserve">2.6 Reduce, don’t rest - with one declared departure.</w:t>
-      </w:r>
-      <w:r>
-        <w:t xml:space="preserve"> </w:t>
-      </w:r>
-      <w:r>
-        <w:t xml:space="preserve">After a single symptom flare, the response is to continue daily sub-threshold exercise at</w:t>
-      </w:r>
-      <w:r>
-        <w:t xml:space="preserve"> </w:t>
-      </w:r>
-      <w:r>
-        <w:rPr>
-          <w:i/>
-          <w:iCs/>
-        </w:rPr>
-        <w:t xml:space="preserve">reduced</w:t>
-      </w:r>
-      <w:r>
-        <w:t xml:space="preserve"> </w:t>
-      </w:r>
-      <w:r>
-        <w:t xml:space="preserve">intensity, not to prescribe a rest day; the only prohibition is sustained supra-threshold exercise [11]. The framework departs from this in one specific circumstance - two consecutive flaring sessions - and labels that departure as a design decision rather than an evidence-derived rule (§3, Stage 4; §7).</w:t>
-      </w:r>
-    </w:p>
-    <w:p>
-      <w:pPr>
-        <w:pStyle w:val="BodyText"/>
-      </w:pPr>
-      <w:r>
-        <w:rPr>
-          <w:b/>
-          <w:bCs/>
-        </w:rPr>
-        <w:t xml:space="preserve">2.7 Active rehabilitation, not pacing.</w:t>
-      </w:r>
-      <w:r>
-        <w:t xml:space="preserve"> </w:t>
-      </w:r>
-      <w:r>
-        <w:t xml:space="preserve">The band is a training target to be progressively raised, not an exertion alarm (§6).</w:t>
-      </w:r>
-    </w:p>
-    <w:p>
-      <w:r>
-        <w:pict>
-          <v:rect style="width:0;height:1.5pt" o:hralign="center" o:hrstd="t" o:hr="t"/>
-        </w:pict>
-      </w:r>
-    </w:p>
-    <w:bookmarkEnd w:id="10"/>
-    <w:bookmarkStart w:id="16" w:name="the-five-stage-workflow"/>
-    <w:p>
-      <w:pPr>
-        <w:pStyle w:val="Heading2"/>
-      </w:pPr>
-      <w:r>
         <w:t xml:space="preserve">3. The five-stage workflow</w:t>
       </w:r>
     </w:p>
-    <w:bookmarkStart w:id="11" w:name="stage-1---baseline-and-safety-screen"/>
+    <w:bookmarkStart w:id="10" w:name="stage-1---baseline-and-safety-screen"/>
     <w:p>
       <w:pPr>
         <w:pStyle w:val="Heading3"/>
@@ -632,8 +307,8 @@
         <w:t xml:space="preserve">any red flag, or a resting symptom score at least 8 then exit; no test.</w:t>
       </w:r>
     </w:p>
-    <w:bookmarkEnd w:id="11"/>
-    <w:bookmarkStart w:id="12" w:name="X3a9f555de84452f5b94877868e017eba3c64ff4"/>
+    <w:bookmarkEnd w:id="10"/>
+    <w:bookmarkStart w:id="11" w:name="X3a9f555de84452f5b94877868e017eba3c64ff4"/>
     <w:p>
       <w:pPr>
         <w:pStyle w:val="Heading3"/>
@@ -1125,8 +800,8 @@
         <w:t xml:space="preserve">HRt in bpm plus an interpretation, synced to the clinic record as the first point on the recovery trajectory.</w:t>
       </w:r>
     </w:p>
-    <w:bookmarkEnd w:id="12"/>
-    <w:bookmarkStart w:id="13" w:name="Xeb443cb7fff0e141b9251f8cbc811e1ab66c328"/>
+    <w:bookmarkEnd w:id="11"/>
+    <w:bookmarkStart w:id="12" w:name="Xeb443cb7fff0e141b9251f8cbc811e1ab66c328"/>
     <w:p>
       <w:pPr>
         <w:pStyle w:val="Heading3"/>
@@ -1351,8 +1026,8 @@
         <w:t xml:space="preserve">a plain-language prescription the patient can follow, and a structured band (lower and upper bpm) that the tool enforces live.</w:t>
       </w:r>
     </w:p>
-    <w:bookmarkEnd w:id="13"/>
-    <w:bookmarkStart w:id="14" w:name="Xdd918cde6aefd6633beb4fa6631c317cce2f0af"/>
+    <w:bookmarkEnd w:id="12"/>
+    <w:bookmarkStart w:id="13" w:name="Xdd918cde6aefd6633beb4fa6631c317cce2f0af"/>
     <w:p>
       <w:pPr>
         <w:pStyle w:val="Heading3"/>
@@ -1936,8 +1611,8 @@
         <w:t xml:space="preserve">red flag at any point; repeated provocation then rest, regress, or referral.</w:t>
       </w:r>
     </w:p>
-    <w:bookmarkEnd w:id="14"/>
-    <w:bookmarkStart w:id="15" w:name="stage-5---graded-return"/>
+    <w:bookmarkEnd w:id="13"/>
+    <w:bookmarkStart w:id="14" w:name="stage-5---graded-return"/>
     <w:p>
       <w:pPr>
         <w:pStyle w:val="Heading3"/>
@@ -2048,9 +1723,9 @@
         </w:pict>
       </w:r>
     </w:p>
+    <w:bookmarkEnd w:id="14"/>
     <w:bookmarkEnd w:id="15"/>
-    <w:bookmarkEnd w:id="16"/>
-    <w:bookmarkStart w:id="17" w:name="decision-rules-at-a-glance"/>
+    <w:bookmarkStart w:id="16" w:name="decision-rules-at-a-glance"/>
     <w:p>
       <w:pPr>
         <w:pStyle w:val="Heading2"/>
@@ -2659,8 +2334,8 @@
         </w:pict>
       </w:r>
     </w:p>
-    <w:bookmarkEnd w:id="17"/>
-    <w:bookmarkStart w:id="18" w:name="scope-limitations-and-evidence-gaps"/>
+    <w:bookmarkEnd w:id="16"/>
+    <w:bookmarkStart w:id="17" w:name="scope-limitations-and-evidence-gaps"/>
     <w:p>
       <w:pPr>
         <w:pStyle w:val="Heading2"/>
@@ -3032,8 +2707,8 @@
         </w:pict>
       </w:r>
     </w:p>
+    <w:bookmarkEnd w:id="17"/>
     <w:bookmarkEnd w:id="18"/>
-    <w:bookmarkEnd w:id="19"/>
     <w:sectPr>
       <w:footnotePr>
         <w:numRestart w:val="eachSect"/>

</xml_diff>

<commit_message>
Deposit DOCX: fix the page count for real
My page counts were wrong three times running, same cause each time: I measured
a Typst-rendered PDF with tight custom margins while you upload a DOCX, which
Word paginates with much larger default styling. Measuring the wrong artifact.

Two fixes. Cut to the executable protocol only — title, five-stage workflow,
decision rules — 3,544 to 2,589 words. And generate against a compact Word
reference template (9pt body, 0.5in margins, tightened heading spacing) so the
DOCX itself is small rather than relying on a rendering that isn't Word's.

~2.8pp with the template, ~5.6pp even at Word defaults. Under the limit either
way, which is the point — no estimate should be load-bearing again.
</commit_message>
<xml_diff>
--- a/docs/sst-publications/03-protocolsio-DEPOSIT.docx
+++ b/docs/sst-publications/03-protocolsio-DEPOSIT.docx
@@ -2,7 +2,7 @@
 <file path=word/document.xml><?xml version="1.0" encoding="utf-8"?>
 <w:document xmlns:w="http://schemas.openxmlformats.org/wordprocessingml/2006/main" xmlns:m="http://schemas.openxmlformats.org/officeDocument/2006/math" xmlns:r="http://schemas.openxmlformats.org/officeDocument/2006/relationships" xmlns:o="urn:schemas-microsoft-com:office:office" xmlns:v="urn:schemas-microsoft-com:vml" xmlns:w10="urn:schemas-microsoft-com:office:word" xmlns:a="http://schemas.openxmlformats.org/drawingml/2006/main" xmlns:pic="http://schemas.openxmlformats.org/drawingml/2006/picture" xmlns:wp="http://schemas.openxmlformats.org/drawingml/2006/wordprocessingDrawing">
   <w:body>
-    <w:bookmarkStart w:id="18" w:name="Xa5cd5602973855d8e0c87c2fcf965e7ddfea9ab"/>
+    <w:bookmarkStart w:id="17" w:name="Xa5cd5602973855d8e0c87c2fcf965e7ddfea9ab"/>
     <w:p>
       <w:pPr>
         <w:pStyle w:val="Heading1"/>
@@ -2335,380 +2335,7 @@
       </w:r>
     </w:p>
     <w:bookmarkEnd w:id="16"/>
-    <w:bookmarkStart w:id="17" w:name="scope-limitations-and-evidence-gaps"/>
-    <w:p>
-      <w:pPr>
-        <w:pStyle w:val="Heading2"/>
-      </w:pPr>
-      <w:r>
-        <w:t xml:space="preserve">7. Scope, limitations, and evidence gaps</w:t>
-      </w:r>
-    </w:p>
-    <w:p>
-      <w:pPr>
-        <w:pStyle w:val="FirstParagraph"/>
-      </w:pPr>
-      <w:r>
-        <w:rPr>
-          <w:b/>
-          <w:bCs/>
-        </w:rPr>
-        <w:t xml:space="preserve">Scope: delivery and verification, not efficacy.</w:t>
-      </w:r>
-      <w:r>
-        <w:t xml:space="preserve"> </w:t>
-      </w:r>
-      <w:r>
-        <w:t xml:space="preserve">This is a delivery framework. It standardises faithful delivery of an established prescription. It does not establish a clinical outcome, and</w:t>
-      </w:r>
-      <w:r>
-        <w:t xml:space="preserve"> </w:t>
-      </w:r>
-      <w:r>
-        <w:rPr>
-          <w:b/>
-          <w:bCs/>
-        </w:rPr>
-        <w:t xml:space="preserve">no effectiveness claim of any kind is made for the software</w:t>
-      </w:r>
-      <w:r>
-        <w:t xml:space="preserve">. Whether digital delivery improves outcomes over conventional paper prescription is an entirely open empirical question that this paper does not address and on which the author holds no data. The underlying treatment evidence is strongest in adolescents with acute sport-related concussion [5,6]; adults and persistent-symptom populations are supported but less strongly.</w:t>
-      </w:r>
-    </w:p>
-    <w:p>
-      <w:pPr>
-        <w:pStyle w:val="BodyText"/>
-      </w:pPr>
-      <w:r>
-        <w:rPr>
-          <w:b/>
-          <w:bCs/>
-        </w:rPr>
-        <w:t xml:space="preserve">The home-administered graded test is unvalidated.</w:t>
-      </w:r>
-      <w:r>
-        <w:t xml:space="preserve"> </w:t>
-      </w:r>
-      <w:r>
-        <w:t xml:space="preserve">Concurrent validity of the home-administered graded ramp against the clinician-administered, in-clinic Buffalo Concussion Treadmill Test has not been established. This is the single most consequential open question in the framework, because the entire measured-threshold rationale depends on the measurement being trustworthy. It is the subject of a separate, prospectively registered method-comparison study (Bland-Altman agreement and intraclass correlation, stratified by heart-rate source provenance), which requires full human-research ethics review and is out of scope here. Until that study reports,</w:t>
-      </w:r>
-      <w:r>
-        <w:t xml:space="preserve"> </w:t>
-      </w:r>
-      <w:r>
-        <w:t xml:space="preserve">“we measure the threshold”</w:t>
-      </w:r>
-      <w:r>
-        <w:t xml:space="preserve"> </w:t>
-      </w:r>
-      <w:r>
-        <w:t xml:space="preserve">should be read as a claim about the</w:t>
-      </w:r>
-      <w:r>
-        <w:t xml:space="preserve"> </w:t>
-      </w:r>
-      <w:r>
-        <w:rPr>
-          <w:i/>
-          <w:iCs/>
-        </w:rPr>
-        <w:t xml:space="preserve">construct being measured</w:t>
-      </w:r>
-      <w:r>
-        <w:t xml:space="preserve">, not as a claim that a home test measures it as accurately as the clinic reference standard.</w:t>
-      </w:r>
-    </w:p>
-    <w:p>
-      <w:pPr>
-        <w:pStyle w:val="BodyText"/>
-      </w:pPr>
-      <w:r>
-        <w:rPr>
-          <w:b/>
-          <w:bCs/>
-        </w:rPr>
-        <w:t xml:space="preserve">Workload is unquantified.</w:t>
-      </w:r>
-      <w:r>
-        <w:t xml:space="preserve"> </w:t>
-      </w:r>
-      <w:r>
-        <w:t xml:space="preserve">As stated in Stage 2, the graded ramp is delivered as standardised per-minute step-up</w:t>
-      </w:r>
-      <w:r>
-        <w:t xml:space="preserve"> </w:t>
-      </w:r>
-      <w:r>
-        <w:rPr>
-          <w:i/>
-          <w:iCs/>
-        </w:rPr>
-        <w:t xml:space="preserve">prompts</w:t>
-      </w:r>
-      <w:r>
-        <w:t xml:space="preserve">, not as a quantified Balke protocol. No speed, gradient, or power value is set or recorded. Consequently: the external workload at which a threshold occurred is unknown; the ramp rate is not standardised across patients, across equipment, or across serial tests within the same patient; and serial HRt comparisons carry an unquantified confounding from ramp-rate variability. A clinician should treat the serial HRt trajectory as informative but not as a controlled repeated measure in the way a clinic treadmill protocol would be.</w:t>
-      </w:r>
-    </w:p>
-    <w:p>
-      <w:pPr>
-        <w:pStyle w:val="BodyText"/>
-      </w:pPr>
-      <w:r>
-        <w:rPr>
-          <w:b/>
-          <w:bCs/>
-        </w:rPr>
-        <w:t xml:space="preserve">Perceived exertion is not captured as a curve.</w:t>
-      </w:r>
-      <w:r>
-        <w:t xml:space="preserve"> </w:t>
-      </w:r>
-      <w:r>
-        <w:t xml:space="preserve">The workflow records an exhaustion marker as a single end-of-test determination rather than a per-minute Borg rating. A clinician accustomed to reading the RPE trajectory alongside heart rate and symptoms will not find one here.</w:t>
-      </w:r>
-    </w:p>
-    <w:p>
-      <w:pPr>
-        <w:pStyle w:val="BodyText"/>
-      </w:pPr>
-      <w:r>
-        <w:rPr>
-          <w:b/>
-          <w:bCs/>
-        </w:rPr>
-        <w:t xml:space="preserve">Termination type does not gate classification.</w:t>
-      </w:r>
-      <w:r>
-        <w:t xml:space="preserve"> </w:t>
-      </w:r>
-      <w:r>
-        <w:t xml:space="preserve">As detailed in Stage 2, an early voluntary stop, a test reaching the 20-stage maximum, and a genuine volitional exhaustion all classify as</w:t>
-      </w:r>
-      <w:r>
-        <w:t xml:space="preserve"> </w:t>
-      </w:r>
-      <w:r>
-        <w:rPr>
-          <w:i/>
-          <w:iCs/>
-        </w:rPr>
-        <w:t xml:space="preserve">no-intolerance</w:t>
-      </w:r>
-      <w:r>
-        <w:t xml:space="preserve"> </w:t>
-      </w:r>
-      <w:r>
-        <w:t xml:space="preserve">when no 3 or more-point rise occurred. Because a no-intolerance re-test raises the clearance-review flag, an under-exerted test can produce a spuriously reassuring signal. Mitigations - mandatory clinician review and sign-off, and server-side re-derivation from the raw stages - reduce but do not eliminate this. Tightening the classification to require evidence of adequate exertion is a known and unaddressed improvement.</w:t>
-      </w:r>
-    </w:p>
-    <w:p>
-      <w:pPr>
-        <w:pStyle w:val="BodyText"/>
-      </w:pPr>
-      <w:r>
-        <w:rPr>
-          <w:b/>
-          <w:bCs/>
-        </w:rPr>
-        <w:t xml:space="preserve">Only one arm of the prognostic criterion is operative.</w:t>
-      </w:r>
-      <w:r>
-        <w:t xml:space="preserve"> </w:t>
-      </w:r>
-      <w:r>
-        <w:t xml:space="preserve">The published prolonged-recovery criterion combines an absolute HRt &lt;135 bpm with a blunted heart-rate response (threshold minus resting no more than 50 bpm) [12]. No resting heart rate is captured in the current workflow, so only the absolute criterion can fire. The composite Haider criterion is</w:t>
-      </w:r>
-      <w:r>
-        <w:t xml:space="preserve"> </w:t>
-      </w:r>
-      <w:r>
-        <w:rPr>
-          <w:i/>
-          <w:iCs/>
-        </w:rPr>
-        <w:t xml:space="preserve">not</w:t>
-      </w:r>
-      <w:r>
-        <w:t xml:space="preserve"> </w:t>
-      </w:r>
-      <w:r>
-        <w:t xml:space="preserve">applied, and the flag should not be described as though it were.</w:t>
-      </w:r>
-    </w:p>
-    <w:p>
-      <w:pPr>
-        <w:pStyle w:val="BodyText"/>
-      </w:pPr>
-      <w:r>
-        <w:rPr>
-          <w:b/>
-          <w:bCs/>
-        </w:rPr>
-        <w:t xml:space="preserve">There is no validated severity-adjusted starting dose.</w:t>
-      </w:r>
-      <w:r>
-        <w:t xml:space="preserve"> </w:t>
-      </w:r>
-      <w:r>
-        <w:t xml:space="preserve">The percentage-of-HRt band is the only individualisation the evidence supports. A more cautious starting point for a highly symptomatic patient - a shorter first session, or starting at the low end of the band - is clinician judgement, and the workflow deliberately does not present it as evidence-derived. Deriving and validating a severity-adjusted starting dose is a distinct research question.</w:t>
-      </w:r>
-    </w:p>
-    <w:p>
-      <w:pPr>
-        <w:pStyle w:val="BodyText"/>
-      </w:pPr>
-      <w:r>
-        <w:rPr>
-          <w:b/>
-          <w:bCs/>
-        </w:rPr>
-        <w:t xml:space="preserve">The trials specify no next-day symptom-contingent rule.</w:t>
-      </w:r>
-      <w:r>
-        <w:t xml:space="preserve"> </w:t>
-      </w:r>
-      <w:r>
-        <w:t xml:space="preserve">The workflow records a next-day flare flag and acts on it, but the trials did not prescribe a specific</w:t>
-      </w:r>
-      <w:r>
-        <w:t xml:space="preserve"> </w:t>
-      </w:r>
-      <w:r>
-        <w:t xml:space="preserve">“if next-day symptoms, then X”</w:t>
-      </w:r>
-      <w:r>
-        <w:t xml:space="preserve"> </w:t>
-      </w:r>
-      <w:r>
-        <w:t xml:space="preserve">dose adjustment. The reduce-don’t-rest response is drawn from the general management principle [11], not from a trial-specified next-day algorithm.</w:t>
-      </w:r>
-    </w:p>
-    <w:p>
-      <w:pPr>
-        <w:pStyle w:val="BodyText"/>
-      </w:pPr>
-      <w:r>
-        <w:rPr>
-          <w:b/>
-          <w:bCs/>
-        </w:rPr>
-        <w:t xml:space="preserve">There is no published protocol for a large or delayed flare.</w:t>
-      </w:r>
-      <w:r>
-        <w:t xml:space="preserve"> </w:t>
-      </w:r>
-      <w:r>
-        <w:t xml:space="preserve">Management of a substantial or late-onset symptom spike, as distinct from the transient tolerated worsening the consensus permits [4], is not specified in the literature. The workflow routes such events to clinician review rather than encoding an unvalidated automated response - with one exception, disclosed next.</w:t>
-      </w:r>
-    </w:p>
-    <w:p>
-      <w:pPr>
-        <w:pStyle w:val="BodyText"/>
-      </w:pPr>
-      <w:r>
-        <w:rPr>
-          <w:b/>
-          <w:bCs/>
-        </w:rPr>
-        <w:t xml:space="preserve">Digital conservatisms are design choices, not evidence.</w:t>
-      </w:r>
-      <w:r>
-        <w:t xml:space="preserve"> </w:t>
-      </w:r>
-      <w:r>
-        <w:t xml:space="preserve">The following are decisions of this workflow, not parameters any trial specifies: the requirement for a</w:t>
-      </w:r>
-      <w:r>
-        <w:t xml:space="preserve"> </w:t>
-      </w:r>
-      <w:r>
-        <w:rPr>
-          <w:i/>
-          <w:iCs/>
-        </w:rPr>
-        <w:t xml:space="preserve">run</w:t>
-      </w:r>
-      <w:r>
-        <w:t xml:space="preserve"> </w:t>
-      </w:r>
-      <w:r>
-        <w:t xml:space="preserve">of three clean sessions before an advance; the requirement that those sessions be live-verified; the 80%-of-prescribed-minutes completion gate; the specific 5 bpm progression increment; the two-consecutive-flares rest trigger, which is a deliberate departure from the reduce-don’t-rest principle for repeated day-over-day provocation, a scenario the trials do not cover; and the 48-hour re-test spacing. They are stated as design decisions and should not be cited as findings.</w:t>
-      </w:r>
-    </w:p>
-    <w:p>
-      <w:pPr>
-        <w:pStyle w:val="BodyText"/>
-      </w:pPr>
-      <w:r>
-        <w:rPr>
-          <w:b/>
-          <w:bCs/>
-        </w:rPr>
-        <w:t xml:space="preserve">No washout interval is specified.</w:t>
-      </w:r>
-      <w:r>
-        <w:t xml:space="preserve"> </w:t>
-      </w:r>
-      <w:r>
-        <w:t xml:space="preserve">The evidence does not define an interval between the threshold test and the first training session; the framework leaves this to clinician timing.</w:t>
-      </w:r>
-    </w:p>
-    <w:p>
-      <w:pPr>
-        <w:pStyle w:val="BodyText"/>
-      </w:pPr>
-      <w:r>
-        <w:rPr>
-          <w:b/>
-          <w:bCs/>
-        </w:rPr>
-        <w:t xml:space="preserve">Regulatory scope, with its honest bound.</w:t>
-      </w:r>
-      <w:r>
-        <w:t xml:space="preserve"> </w:t>
-      </w:r>
-      <w:r>
-        <w:t xml:space="preserve">This framework describes a</w:t>
-      </w:r>
-      <w:r>
-        <w:t xml:space="preserve"> </w:t>
-      </w:r>
-      <w:r>
-        <w:rPr>
-          <w:b/>
-          <w:bCs/>
-        </w:rPr>
-        <w:t xml:space="preserve">clinician-directed rehabilitation-assistance and monitoring tool, not a diagnostic or treatment medical device</w:t>
-      </w:r>
-      <w:r>
-        <w:t xml:space="preserve">. The clinician makes every clinical decision - appropriateness, interpretation, band, progression, clearance - and the software executes, paces, monitors, and records a protocol the clinician selected and can override. The intended primary user is a registered exercise physiologist working from a diagnosis already made, which is what makes the graded test a rehabilitation baseline measure rather than a diagnostic provocative test (§2.2). This is the basis for positioning the tool within the clinical-decision-support carve-out (FDA 21st Century Cures Act §3060; TGA clinical-decision-support exclusion).</w:t>
-      </w:r>
-      <w:r>
-        <w:t xml:space="preserve"> </w:t>
-      </w:r>
-      <w:r>
-        <w:rPr>
-          <w:b/>
-          <w:bCs/>
-        </w:rPr>
-        <w:t xml:space="preserve">This positioning reduces but does not guarantee non-device status</w:t>
-      </w:r>
-      <w:r>
-        <w:t xml:space="preserve"> </w:t>
-      </w:r>
-      <w:r>
-        <w:t xml:space="preserve">- classification follows claims and intended use, and the provocative element of graded testing is a genuine residual exposure independent of how the band is computed. A software-as-a-medical-device scoping opinion should be obtained before launch.</w:t>
-      </w:r>
-    </w:p>
-    <w:p>
-      <w:r>
-        <w:pict>
-          <v:rect style="width:0;height:1.5pt" o:hralign="center" o:hrstd="t" o:hr="t"/>
-        </w:pict>
-      </w:r>
-    </w:p>
     <w:bookmarkEnd w:id="17"/>
-    <w:bookmarkEnd w:id="18"/>
     <w:sectPr>
       <w:footnotePr>
         <w:numRestart w:val="eachSect"/>
@@ -3071,7 +2698,7 @@
     </w:rPrDefault>
     <w:pPrDefault>
       <w:pPr>
-        <w:spacing w:after="200"/>
+        <w:spacing w:after="40"/>
       </w:pPr>
     </w:pPrDefault>
   </w:docDefaults>
@@ -3086,7 +2713,7 @@
     <w:link w:val="BodyTextChar"/>
     <w:qFormat/>
     <w:pPr>
-      <w:spacing w:after="180" w:before="180"/>
+      <w:spacing w:after="40" w:before="60"/>
     </w:pPr>
   </w:style>
   <w:style w:customStyle="1" w:styleId="FirstParagraph" w:type="paragraph">
@@ -3100,7 +2727,7 @@
     <w:basedOn w:val="BodyText"/>
     <w:qFormat/>
     <w:pPr>
-      <w:spacing w:after="36" w:before="36"/>
+      <w:spacing w:after="40" w:before="60"/>
     </w:pPr>
   </w:style>
   <w:style w:styleId="Title" w:type="paragraph">
@@ -3112,7 +2739,7 @@
     <w:qFormat/>
     <w:rsid w:val="00A10FD9"/>
     <w:pPr>
-      <w:spacing w:after="80" w:line="240" w:lineRule="auto"/>
+      <w:spacing w:after="40" w:line="200" w:lineRule="auto"/>
       <w:contextualSpacing/>
       <w:jc w:val="center"/>
     </w:pPr>
@@ -3204,7 +2831,7 @@
     <w:pPr>
       <w:keepNext/>
       <w:keepLines/>
-      <w:spacing w:after="0" w:before="300"/>
+      <w:spacing w:after="40" w:before="60"/>
       <w:jc w:val="center"/>
     </w:pPr>
     <w:rPr>
@@ -3221,7 +2848,7 @@
     <w:pPr>
       <w:keepNext/>
       <w:keepLines/>
-      <w:spacing w:after="300" w:before="100"/>
+      <w:spacing w:after="40" w:before="60"/>
     </w:pPr>
     <w:rPr>
       <w:sz w:val="20"/>
@@ -3247,7 +2874,7 @@
     <w:pPr>
       <w:keepNext/>
       <w:keepLines/>
-      <w:spacing w:after="80" w:before="360"/>
+      <w:spacing w:after="40" w:before="60"/>
       <w:outlineLvl w:val="0"/>
     </w:pPr>
     <w:rPr>
@@ -3270,7 +2897,7 @@
     <w:pPr>
       <w:keepNext/>
       <w:keepLines/>
-      <w:spacing w:after="80" w:before="160"/>
+      <w:spacing w:after="40" w:before="60"/>
       <w:outlineLvl w:val="1"/>
     </w:pPr>
     <w:rPr>
@@ -3293,7 +2920,7 @@
     <w:pPr>
       <w:keepNext/>
       <w:keepLines/>
-      <w:spacing w:after="80" w:before="160"/>
+      <w:spacing w:after="40" w:before="60"/>
       <w:outlineLvl w:val="2"/>
     </w:pPr>
     <w:rPr>
@@ -3316,7 +2943,7 @@
     <w:pPr>
       <w:keepNext/>
       <w:keepLines/>
-      <w:spacing w:after="40" w:before="80"/>
+      <w:spacing w:after="40" w:before="60"/>
       <w:outlineLvl w:val="3"/>
     </w:pPr>
     <w:rPr>
@@ -3339,7 +2966,7 @@
     <w:pPr>
       <w:keepNext/>
       <w:keepLines/>
-      <w:spacing w:after="40" w:before="80"/>
+      <w:spacing w:after="40" w:before="60"/>
       <w:outlineLvl w:val="4"/>
     </w:pPr>
     <w:rPr>
@@ -3360,7 +2987,7 @@
     <w:pPr>
       <w:keepNext/>
       <w:keepLines/>
-      <w:spacing w:after="0" w:before="40"/>
+      <w:spacing w:after="40" w:before="60"/>
       <w:outlineLvl w:val="5"/>
     </w:pPr>
     <w:rPr>
@@ -3383,7 +3010,7 @@
     <w:pPr>
       <w:keepNext/>
       <w:keepLines/>
-      <w:spacing w:after="0" w:before="40"/>
+      <w:spacing w:after="40" w:before="60"/>
       <w:outlineLvl w:val="6"/>
     </w:pPr>
     <w:rPr>
@@ -3404,7 +3031,7 @@
     <w:pPr>
       <w:keepNext/>
       <w:keepLines/>
-      <w:spacing w:after="0"/>
+      <w:spacing w:after="40"/>
       <w:outlineLvl w:val="7"/>
     </w:pPr>
     <w:rPr>
@@ -3427,7 +3054,7 @@
     <w:pPr>
       <w:keepNext/>
       <w:keepLines/>
-      <w:spacing w:after="0"/>
+      <w:spacing w:after="40"/>
       <w:outlineLvl w:val="8"/>
     </w:pPr>
     <w:rPr>
@@ -3562,7 +3189,7 @@
     <w:unhideWhenUsed/>
     <w:qFormat/>
     <w:pPr>
-      <w:spacing w:after="100" w:before="100"/>
+      <w:spacing w:after="40" w:before="60"/>
       <w:ind w:firstLine="0" w:left="480" w:right="480"/>
     </w:pPr>
   </w:style>
@@ -3582,7 +3209,7 @@
     <w:unhideWhenUsed/>
     <w:qFormat/>
     <w:pPr>
-      <w:spacing w:after="100" w:before="100"/>
+      <w:spacing w:after="40" w:before="60"/>
       <w:ind w:firstLine="0" w:left="480" w:right="480"/>
     </w:pPr>
   </w:style>
@@ -3622,7 +3249,7 @@
     <w:pPr>
       <w:keepNext/>
       <w:keepLines/>
-      <w:spacing w:after="0"/>
+      <w:spacing w:after="40"/>
     </w:pPr>
     <w:rPr>
       <w:b/>
@@ -3637,7 +3264,7 @@
     <w:basedOn w:val="Normal"/>
     <w:link w:val="BodyTextChar"/>
     <w:pPr>
-      <w:spacing w:after="120" w:before="0"/>
+      <w:spacing w:after="40" w:before="60"/>
     </w:pPr>
     <w:rPr>
       <w:i/>
@@ -3704,7 +3331,7 @@
     <w:unhideWhenUsed/>
     <w:qFormat/>
     <w:pPr>
-      <w:spacing w:before="240" w:line="259" w:lineRule="auto"/>
+      <w:spacing w:before="60" w:line="200" w:lineRule="auto"/>
       <w:outlineLvl w:val="9"/>
     </w:pPr>
     <w:rPr>

</xml_diff>